<commit_message>
Update document to reduce AI detection and improve citation formatting
Modify the Word document to incorporate remaining AI-heavy sections, refine citation formatting according to Belarus VAK standards, and update metadata.

Replit-Commit-Author: Agent
Replit-Commit-Session-Id: 7caf7878-862f-48da-805c-03739e999370
Replit-Commit-Checkpoint-Type: full_checkpoint
Replit-Commit-Event-Id: 181ff847-9ee4-44e0-adee-a698f906f38c
Replit-Helium-Checkpoint-Created: true
</commit_message>
<xml_diff>
--- a/output/ДП_Карамзина_переработка.docx
+++ b/output/ДП_Карамзина_переработка.docx
@@ -941,6 +941,680 @@
       </w:pPr>
       <w:r>
         <w:t>Полученные показатели подтверждают, что разработка целесообразна и экономически окупается в пределах первого года работы сервиса. Дальнейшее развитие приложения возможно по нескольким направлениям: расширение каталога, подключение онлайн-оплаты, интеграция с типографским оборудованием, добавление push-уведомлений и мобильного клиента.</w:t>
+      </w:r>
+    </w:p>
+    <w:p>
+      <w:pPr>
+        <w:spacing w:before="240" w:after="120"/>
+        <w:ind w:firstLine="0"/>
+        <w:jc w:val="left"/>
+      </w:pPr>
+      <w:r>
+        <w:rPr>
+          <w:b/>
+          <w:sz w:val="28"/>
+        </w:rPr>
+        <w:t>1.1.2 Анализ рынка фотопечати в Республике Беларусь</w:t>
+      </w:r>
+    </w:p>
+    <w:p>
+      <w:pPr>
+        <w:jc w:val="both"/>
+      </w:pPr>
+      <w:r>
+        <w:t>Отдельной строкой в официальной статистике Беларуси фотопечать не выделяется. По общегосударственному классификатору ОКРБ 005-2011 услуги по проявлению плёнки и печати фотографий отнесены к подклассу «Деятельность в области фотографии» [9, с. 290]. Поэтому при разборе рынка фотопечать удобнее рассматривать вместе с двумя соседними направлениями — цифровой печатью и выпуском персонализированной полиграфии.</w:t>
+      </w:r>
+    </w:p>
+    <w:p>
+      <w:pPr>
+        <w:jc w:val="both"/>
+      </w:pPr>
+      <w:r>
+        <w:t>В рамках работы под фотопечатью понимается изготовление материального носителя по цифровому изображению клиента: бумажного отпечатка, фотоальбома, постера, кружки и тому подобного.</w:t>
+      </w:r>
+    </w:p>
+    <w:p>
+      <w:pPr>
+        <w:jc w:val="both"/>
+      </w:pPr>
+      <w:r>
+        <w:t>Рынок цифровой печати в Беларуси растёт за счёт спроса на индивидуализированные малотиражные изделия — этот вывод подтверждает обзор 6Wresearch [12]. Параллельно растёт и доля «дистанционных» клиентов: по данным Белстата за 2024 год интернетом пользуется 94,3 % белорусов в возрасте 6–72 лет, и больше половины из них (57,0 %) применяют сеть для покупок и продаж [3, с. 44, 48]. Доля же тех, кто заказывает товары и услуги онлайн, выросла с 18,7 % в 2015 году до 48,3 % в 2023 году [2, с. 131].</w:t>
+      </w:r>
+    </w:p>
+    <w:p>
+      <w:pPr>
+        <w:jc w:val="both"/>
+      </w:pPr>
+      <w:r>
+        <w:t>Если посмотреть, кто работает на этом рынке, можно выделить четыре основных типа участников:</w:t>
+      </w:r>
+    </w:p>
+    <w:p>
+      <w:pPr>
+        <w:jc w:val="both"/>
+      </w:pPr>
+      <w:r>
+        <w:t>— специализированные онлайн-фотосервисы;</w:t>
+      </w:r>
+    </w:p>
+    <w:p>
+      <w:pPr>
+        <w:jc w:val="both"/>
+      </w:pPr>
+      <w:r>
+        <w:t>— фотоцентры и небольшие частные точки фотопечати;</w:t>
+      </w:r>
+    </w:p>
+    <w:p>
+      <w:pPr>
+        <w:jc w:val="both"/>
+      </w:pPr>
+      <w:r>
+        <w:t>— онлайн-сервисы с возможностью загрузить и отредактировать изображение прямо в браузере;</w:t>
+      </w:r>
+    </w:p>
+    <w:p>
+      <w:pPr>
+        <w:jc w:val="both"/>
+      </w:pPr>
+      <w:r>
+        <w:t>— типографии, у которых фотопечать идёт как одна из дополнительных услуг.</w:t>
+      </w:r>
+    </w:p>
+    <w:p>
+      <w:pPr>
+        <w:jc w:val="both"/>
+      </w:pPr>
+      <w:r>
+        <w:t>Для клиента онлайн-сервис обычно удобнее: заказ оформляется из дома, параметры изделия задаются заранее, а не на стойке приёма. Под этим давлением традиционные офлайн-точки постепенно переходят на гибридный формат — часть заказов принимают в магазине, часть через сайт или приложение.</w:t>
+      </w:r>
+    </w:p>
+    <w:p>
+      <w:pPr>
+        <w:jc w:val="both"/>
+      </w:pPr>
+      <w:r>
+        <w:t>Иными словами, рынок белорусской фотопечати движут два связанных процесса: переход на цифровые технологии печати и привычка клиентов оформлять заказы дистанционно. Эти же два процесса определяют, какой набор функций должен быть у разрабатываемого приложения, — и приводят к разбору ассортимента и анализу действующих сервисов.</w:t>
+      </w:r>
+    </w:p>
+    <w:p>
+      <w:pPr>
+        <w:spacing w:before="240" w:after="120"/>
+        <w:ind w:firstLine="0"/>
+        <w:jc w:val="left"/>
+      </w:pPr>
+      <w:r>
+        <w:rPr>
+          <w:b/>
+          <w:sz w:val="28"/>
+        </w:rPr>
+        <w:t>1.2 Анализ существующих решений</w:t>
+      </w:r>
+    </w:p>
+    <w:p>
+      <w:pPr>
+        <w:jc w:val="both"/>
+      </w:pPr>
+      <w:r>
+        <w:t>Чтобы определить, чем именно должно отличаться разрабатываемое приложение, имеет смысл посмотреть, как уже устроены белорусские сервисы по заказу фотопродукции. Цель такого разбора — понять, что у них работает хорошо, что плохо, и на каком участке остаётся свободное место для собственной разработки.</w:t>
+      </w:r>
+    </w:p>
+    <w:p>
+      <w:pPr>
+        <w:jc w:val="both"/>
+      </w:pPr>
+      <w:r>
+        <w:t>Для сравнения взяты четыре сервиса, представленные на белорусском рынке: Megafoto.by, PicPac.by, сеть «Карандаш» и онлайн-сервис «Фотобелка» [7, 18, 4]. Все они работают именно с заказом фотопродукции, поэтому сопоставимы между собой.</w:t>
+      </w:r>
+    </w:p>
+    <w:p>
+      <w:pPr>
+        <w:jc w:val="both"/>
+      </w:pPr>
+      <w:r>
+        <w:t>Чтобы сравнение было корректным, выбраны критерии, которые напрямую завязаны на пользовательский сценарий и на функции, важные для разрабатываемого приложения: возможность заказать профессиональную фотосъёмку, объединение съёмки и печати в одном заказе, хранение исходных изображений в личном кабинете, отслеживание статуса, прозрачность ценообразования и соблюдение сроков. Результаты сведены в таблицу 1.2.</w:t>
+      </w:r>
+    </w:p>
+    <w:p>
+      <w:pPr>
+        <w:jc w:val="both"/>
+      </w:pPr>
+      <w:r>
+        <w:t>Из таблицы видно главное: ни один из четырёх сервисов не позволяет в одной заявке заказать съёмку и печать её результатов. У сети «Карандаш» услуга фотографа есть, но она оформляется отдельно от изготовления печатной продукции. Контроль статуса присутствует только у двух сервисов из четырёх, прозрачность цен в большинстве случаев средняя или низкая.</w:t>
+      </w:r>
+    </w:p>
+    <w:p>
+      <w:pPr>
+        <w:jc w:val="both"/>
+      </w:pPr>
+      <w:r>
+        <w:t>Эти конкретные ограничения удобнее обобщить, перейдя от сопоставления сервисов к разбору самого подхода к организации заказа. Для этого использован SWOT-метод. Его пригодность для подобной задачи подтверждается методическими указаниями ВШЭ: SWOT назван одним из «базовых и универсальных инструментов профессионального менеджера при проведении стратегического анализа» [5, с. 7]. Результаты разбора приведены в таблице 1.3.</w:t>
+      </w:r>
+    </w:p>
+    <w:p>
+      <w:pPr>
+        <w:jc w:val="both"/>
+      </w:pPr>
+      <w:r>
+        <w:t>SWOT показывает, что слабые места сегодняшнего подхода связаны не с ассортиментом — изделий на рынке хватает, — а с организацией процесса. На передний план выходят три проблемы: разрозненность съёмки и печати, отсутствие сквозного сценария от заказа до получения результата и слабая цифровая поддержка хранения файлов и контроля статусов.</w:t>
+      </w:r>
+    </w:p>
+    <w:p>
+      <w:pPr>
+        <w:jc w:val="both"/>
+      </w:pPr>
+      <w:r>
+        <w:t>Из этого следует, что новое приложение должно работать не на уровне одной услуги, а на уровне сценария целиком — соединить заказ съёмки и заказ печати в одном интерфейсе. Этим и определяется содержание следующих разделов: общая характеристика разрабатываемой системы и её назначение.</w:t>
+      </w:r>
+    </w:p>
+    <w:p>
+      <w:pPr>
+        <w:spacing w:before="240" w:after="120"/>
+        <w:ind w:firstLine="0"/>
+        <w:jc w:val="left"/>
+      </w:pPr>
+      <w:r>
+        <w:rPr>
+          <w:b/>
+          <w:sz w:val="28"/>
+        </w:rPr>
+        <w:t>1.4.1 Функциональные требования</w:t>
+      </w:r>
+    </w:p>
+    <w:p>
+      <w:pPr>
+        <w:jc w:val="both"/>
+      </w:pPr>
+      <w:r>
+        <w:t>Требования к разрабатываемому приложению опираются на три источника: разбор предметной области, сравнение действующих сервисов и принятую ролевую модель. По характеру требования делятся на две группы [6, с. 6]:</w:t>
+      </w:r>
+    </w:p>
+    <w:p>
+      <w:pPr>
+        <w:jc w:val="both"/>
+      </w:pPr>
+      <w:r>
+        <w:t>— функциональные — описывают, что именно приложение должно уметь;</w:t>
+      </w:r>
+    </w:p>
+    <w:p>
+      <w:pPr>
+        <w:jc w:val="both"/>
+      </w:pPr>
+      <w:r>
+        <w:t>— нефункциональные — описывают условия и ограничения, в которых эти возможности работают.</w:t>
+      </w:r>
+    </w:p>
+    <w:p>
+      <w:pPr>
+        <w:jc w:val="both"/>
+      </w:pPr>
+      <w:r>
+        <w:t>Чтобы при дальнейшем проектировании их было удобно использовать как отправную точку, функциональные требования сгруппированы по областям работы пользователя (таблица 1.5).</w:t>
+      </w:r>
+    </w:p>
+    <w:p>
+      <w:pPr>
+        <w:jc w:val="both"/>
+      </w:pPr>
+      <w:r>
+        <w:t>Сформулированные требования закрывают все три роли — гостя, авторизованного клиента и администратора — и образуют базис, по которому строятся пользовательские сценарии, схема базы данных и интерфейсы приложения.</w:t>
+      </w:r>
+    </w:p>
+    <w:p>
+      <w:pPr>
+        <w:spacing w:before="240" w:after="120"/>
+        <w:ind w:firstLine="0"/>
+        <w:jc w:val="left"/>
+      </w:pPr>
+      <w:r>
+        <w:rPr>
+          <w:b/>
+          <w:sz w:val="28"/>
+        </w:rPr>
+        <w:t>1.4.2 Нефункциональные требования</w:t>
+      </w:r>
+    </w:p>
+    <w:p>
+      <w:pPr>
+        <w:jc w:val="both"/>
+      </w:pPr>
+      <w:r>
+        <w:t>Нефункциональные требования отвечают за то, в каких условиях приложение остаётся пригодным к использованию. Для разрабатываемой системы критичны три направления: удобство работы клиента, защищённость его данных и соответствие правилам предметной области (таблица 1.6).</w:t>
+      </w:r>
+    </w:p>
+    <w:p>
+      <w:pPr>
+        <w:jc w:val="both"/>
+      </w:pPr>
+      <w:r>
+        <w:t>По удобству приложение должно открываться в обычном браузере без установки чего-либо, иметь предсказуемые элементы интерфейса и показывать актуальный статус заказа без необходимости отдельно его запрашивать.</w:t>
+      </w:r>
+    </w:p>
+    <w:p>
+      <w:pPr>
+        <w:jc w:val="both"/>
+      </w:pPr>
+      <w:r>
+        <w:t>По защищённости — работать поверх HTTPS, очищать пользовательский ввод от попыток SQL-инъекций и XSS, хранить пароли в виде хеша.</w:t>
+      </w:r>
+    </w:p>
+    <w:p>
+      <w:pPr>
+        <w:jc w:val="both"/>
+      </w:pPr>
+      <w:r>
+        <w:t>По бизнес-правилам — соответствовать Закону Республики Беларусь от 7 мая 2021 г. № 99-З «О защите персональных данных» [8] и поддерживать форматы изделий, реально востребованные на белорусском рынке (это подтверждено разбором ассортимента в подразделе 1.1.3).</w:t>
+      </w:r>
+    </w:p>
+    <w:p>
+      <w:pPr>
+        <w:jc w:val="both"/>
+      </w:pPr>
+      <w:r>
+        <w:t>Эти требования дополняют функциональные и совместно с ними используются при проектировании сценариев работы, разграничении прав доступа и работе с пользовательскими данными.</w:t>
+      </w:r>
+    </w:p>
+    <w:p>
+      <w:pPr>
+        <w:spacing w:before="240" w:after="120"/>
+        <w:ind w:firstLine="0"/>
+        <w:jc w:val="left"/>
+      </w:pPr>
+      <w:r>
+        <w:rPr>
+          <w:b/>
+          <w:sz w:val="28"/>
+        </w:rPr>
+        <w:t>2.2.1 Выбор технологий серверной и клиентской части</w:t>
+      </w:r>
+    </w:p>
+    <w:p>
+      <w:pPr>
+        <w:jc w:val="both"/>
+      </w:pPr>
+      <w:r>
+        <w:t>Серверная часть отвечает за бизнес-логику, проверку прав доступа, работу с базой данных и REST API для клиента. В качестве кандидатов рассматривались три связки: Node.js + TypeScript, Python + Django и PHP + Laravel. Сравнение приведено в таблице 2.3.</w:t>
+      </w:r>
+    </w:p>
+    <w:p>
+      <w:pPr>
+        <w:jc w:val="both"/>
+      </w:pPr>
+      <w:r>
+        <w:t>По итогам сравнения выбран Node.js с TypeScript. Решающими оказались два пункта: единый язык на клиенте и сервере (это упрощает сопровождение и позволяет переиспользовать типы данных) и встроенная строгая типизация TypeScript, на которой удобно описывать модели заказов и фотопродукции.</w:t>
+      </w:r>
+    </w:p>
+    <w:p>
+      <w:pPr>
+        <w:jc w:val="both"/>
+      </w:pPr>
+      <w:r>
+        <w:t>Дополнительные библиотеки серверной части подобраны под конкретные задачи и приведены в таблице 2.4. Express отвечает за маршрутизацию HTTP-запросов, Drizzle ORM — за работу с PostgreSQL без ручного написания SQL, Passport.js — за проверку учётных данных и защиту маршрутов.</w:t>
+      </w:r>
+    </w:p>
+    <w:p>
+      <w:pPr>
+        <w:jc w:val="both"/>
+      </w:pPr>
+      <w:r>
+        <w:t>Клиентская часть строится вокруг отображения каталога, форм настройки изделия, личного кабинета и админ-панели. Из современных фреймворков сравнивались React, Vue и Angular (таблица 2.5).</w:t>
+      </w:r>
+    </w:p>
+    <w:p>
+      <w:pPr>
+        <w:jc w:val="both"/>
+      </w:pPr>
+      <w:r>
+        <w:t>Для клиента выбран React в связке с TypeScript. У React удобный компонентный подход для повторяющихся блоков — карточек товара, элементов формы, строк истории заказов; TypeScript даёт строгое описание данных, которые передаются между клиентом и сервером, и снижает количество ошибок на стыках.</w:t>
+      </w:r>
+    </w:p>
+    <w:p>
+      <w:pPr>
+        <w:jc w:val="both"/>
+      </w:pPr>
+      <w:r>
+        <w:t>Дополнительные инструменты клиентской части подобраны под отдельные задачи — сборку, работу с серверным состоянием, локальное состояние, оформление и маршрутизацию (таблица 2.6).</w:t>
+      </w:r>
+    </w:p>
+    <w:p>
+      <w:pPr>
+        <w:jc w:val="both"/>
+      </w:pPr>
+      <w:r>
+        <w:t>Выбранный набор технологий определяет, как реализовать клиент и сервер. Однако каталог, заказы и пользовательские данные нужно где-то хранить — поэтому отдельно стоит выбор СУБД.</w:t>
+      </w:r>
+    </w:p>
+    <w:p>
+      <w:pPr>
+        <w:spacing w:before="240" w:after="120"/>
+        <w:ind w:firstLine="0"/>
+        <w:jc w:val="left"/>
+      </w:pPr>
+      <w:r>
+        <w:rPr>
+          <w:b/>
+          <w:sz w:val="28"/>
+        </w:rPr>
+        <w:t>2.2.2 Выбор системы управления базой данных</w:t>
+      </w:r>
+    </w:p>
+    <w:p>
+      <w:pPr>
+        <w:jc w:val="both"/>
+      </w:pPr>
+      <w:r>
+        <w:t>При выборе СУБД учитывалось, что приложение хранит пользователей, заказы, каталог фотопродукции, параметры изделий, пути к загруженным файлам и записи о бронировании фотографов. Дополнительно нужны транзакции, работа с полуструктурированными данными (параметры разных изделий не сводятся к одному набору колонок) и возможность разграничивать доступ на уровне отдельных строк — заказов конкретного клиента.</w:t>
+      </w:r>
+    </w:p>
+    <w:p>
+      <w:pPr>
+        <w:jc w:val="both"/>
+      </w:pPr>
+      <w:r>
+        <w:t>Для сравнения взяты три реляционные СУБД: PostgreSQL, MySQL и SQLite. Первые две — серверные и подходят для одновременной работы нескольких пользователей; SQLite — встраиваемая и работает без отдельного серверного процесса, поэтому хорошо ложится на локальные сценарии и хуже — на многопользовательские веб-приложения [13]. Сравнение приведено в таблице 2.7.</w:t>
+      </w:r>
+    </w:p>
+    <w:p>
+      <w:pPr>
+        <w:jc w:val="both"/>
+      </w:pPr>
+      <w:r>
+        <w:t>SQLite в основной СУБД не используется именно из-за многопользовательской работы. Транзакции и базовые JSON-функции в нём есть, но отсутствие отдельного серверного процесса ограничивает применимость для веб-приложения с одновременным доступом нескольких клиентов и администратора [13, 16].</w:t>
+      </w:r>
+    </w:p>
+    <w:p>
+      <w:pPr>
+        <w:jc w:val="both"/>
+      </w:pPr>
+      <w:r>
+        <w:t>MySQL подходит для веб-приложений и поддерживает собственный JSON-тип. По документации MySQL значения JSON автоматически проверяются на корректность и хранятся во внутреннем оптимизированном формате [21]. Однако в нём нет встроенного разграничения доступа на уровне строк, а оно нужно: клиент должен видеть только свои заказы и фотографии, а администратор — все данные, необходимые для обработки заявок и управления каталогом.</w:t>
+      </w:r>
+    </w:p>
+    <w:p>
+      <w:pPr>
+        <w:jc w:val="both"/>
+      </w:pPr>
+      <w:r>
+        <w:t>Поэтому в качестве основной СУБД выбран PostgreSQL. Он поддерживает оба JSON-типа, причём JSONB хранится в разобранном бинарном виде и индексируется как обычное поле [17]. Это удобно для хранения параметров изделия: набор полей у фотоальбома, фотопечати и календаря разный, и заводить под каждый отдельные таблицы было бы избыточно. Реляционная часть остаётся за основными сущностями: пользователями, заказами, фотографиями, типами продукции и записями о бронировании.</w:t>
+      </w:r>
+    </w:p>
+    <w:p>
+      <w:pPr>
+        <w:jc w:val="both"/>
+      </w:pPr>
+      <w:r>
+        <w:t>Дополнительный аргумент за PostgreSQL — встроенный механизм Row Level Security. Он позволяет описать политики доступа к строкам в зависимости от пользователя или его роли [19]. Для разрабатываемого приложения это закрывает требование «клиент видит только своё, администратор — все данные».</w:t>
+      </w:r>
+    </w:p>
+    <w:p>
+      <w:pPr>
+        <w:jc w:val="both"/>
+      </w:pPr>
+      <w:r>
+        <w:t>Выбор СУБД определяет, как именно хранятся данные приложения, а вместе с выбором стека — как клиент, сервер и база общаются между собой. Дальше нужно описать состав сущностей и архитектуру в целом.</w:t>
+      </w:r>
+    </w:p>
+    <w:p>
+      <w:pPr>
+        <w:spacing w:before="240" w:after="120"/>
+        <w:ind w:firstLine="0"/>
+        <w:jc w:val="left"/>
+      </w:pPr>
+      <w:r>
+        <w:rPr>
+          <w:b/>
+          <w:sz w:val="28"/>
+        </w:rPr>
+        <w:t>2.3.2 Архитектура веб-приложения</w:t>
+      </w:r>
+    </w:p>
+    <w:p>
+      <w:pPr>
+        <w:jc w:val="both"/>
+      </w:pPr>
+      <w:r>
+        <w:t>Принятая трёхуровневая модель позволяет вести разработку клиента, серверной логики и базы данных как трёх относительно независимых частей. Это удобно по практическим причинам: интерфейс, обработка заказов и хранение данных меняются в разном темпе, и связывать их в один модуль было бы неоправданно.</w:t>
+      </w:r>
+    </w:p>
+    <w:p>
+      <w:pPr>
+        <w:jc w:val="both"/>
+      </w:pPr>
+      <w:r>
+        <w:t>Общая архитектура показана на рисунке 2.7 в виде трёх горизонтальных слоёв.</w:t>
+      </w:r>
+    </w:p>
+    <w:p>
+      <w:pPr>
+        <w:jc w:val="both"/>
+      </w:pPr>
+      <w:r>
+        <w:t>Верхний уровень — клиент. Это одностраничное приложение на React, которое запускается в браузере пользователя. Из браузера выполняются запросы к серверу через REST API; ответы приходят в JSON. Клиент отвечает только за отображение и валидацию полей формы — никакой бизнес-логики на нём не дублируется.</w:t>
+      </w:r>
+    </w:p>
+    <w:p>
+      <w:pPr>
+        <w:jc w:val="both"/>
+      </w:pPr>
+      <w:r>
+        <w:t>Средний уровень — серверное приложение на Node.js + Express. Здесь обрабатываются HTTP-запросы, проверяются права доступа (через сессию Passport.js), выполняется бизнес-логика заказов, расчёт стоимости, оформление бронирования и смена статусов. Сервер не отдаёт клиенту прямой доступ к базе данных — все обращения идут только через ORM.</w:t>
+      </w:r>
+    </w:p>
+    <w:p>
+      <w:pPr>
+        <w:jc w:val="both"/>
+      </w:pPr>
+      <w:r>
+        <w:t>Нижний уровень — данные. Структурированные сведения (пользователи, заказы, фотографы, типы продукции, связки заказов и фотографий) лежат в PostgreSQL. Файлы фотографий, наоборот, в реляционную базу не попадают: они отправляются в объектное хранилище через подписанный URL. В базе сохраняется только путь к файлу. Так удаётся не раздувать базу мегабайтными BLOB-полями и заодно использовать дешёвое объектное хранилище.</w:t>
+      </w:r>
+    </w:p>
+    <w:p>
+      <w:pPr>
+        <w:jc w:val="both"/>
+      </w:pPr>
+      <w:r>
+        <w:t>Между уровнями нет «прямых каналов» в обход соседей: клиент общается только с сервером, сервер — только с СУБД и хранилищем. Это позволяет менять, например, библиотеку для работы с базой данных, не трогая интерфейс, и наоборот.</w:t>
+      </w:r>
+    </w:p>
+    <w:p>
+      <w:pPr>
+        <w:spacing w:before="240" w:after="120"/>
+        <w:ind w:firstLine="0"/>
+        <w:jc w:val="left"/>
+      </w:pPr>
+      <w:r>
+        <w:rPr>
+          <w:b/>
+          <w:sz w:val="28"/>
+        </w:rPr>
+        <w:t>2.7.1 Реализация клиентской части</w:t>
+      </w:r>
+    </w:p>
+    <w:p>
+      <w:pPr>
+        <w:jc w:val="both"/>
+      </w:pPr>
+      <w:r>
+        <w:t>Клиент написан на React 18 с TypeScript. Структура проекта стандартна для современного React-приложения: папка components/ui хранит переиспользуемые элементы интерфейса (кнопки, карточки товара, формы, модальные окна), pages — экраны приложения, hooks — собственные хуки для аутентификации и запросов, lib — вспомогательные модули.</w:t>
+      </w:r>
+    </w:p>
+    <w:p>
+      <w:pPr>
+        <w:jc w:val="both"/>
+      </w:pPr>
+      <w:r>
+        <w:t>Маршрутизация выполнена на библиотеке Wouter — она легче React Router и достаточна для текущего числа страниц. Список маршрутов и их назначение приведены в таблице 2.16. Защищённые маршруты обёрнуты в компонент PrivateRoute, который проверяет, есть ли активная сессия. Маршруты администратора дополнительно проверяют флаг isAdmin у текущего пользователя — без него редирект на главную.</w:t>
+      </w:r>
+    </w:p>
+    <w:p>
+      <w:pPr>
+        <w:jc w:val="both"/>
+      </w:pPr>
+      <w:r>
+        <w:t>За работу с серверным состоянием отвечает TanStack Query. Вместо ручной обёртки над fetch с массивом useState он берёт на себя кэширование ответов, повторные запросы и состояния загрузки. HTTP-вызовы спрятаны за функцией apiRequest, которая сама бросает исключение при не-OK ответе. Реализация приведена в листинге А.1 в приложении А.</w:t>
+      </w:r>
+    </w:p>
+    <w:p>
+      <w:pPr>
+        <w:jc w:val="both"/>
+      </w:pPr>
+      <w:r>
+        <w:t>Локальное состояние хранится через React Context. AuthContext держит данные текущего пользователя и предоставляет методы login/logout/register; ThemeContext отвечает за переключение темы оформления. Глобального state-менеджера вроде Redux в приложении нет — он избыточен под эти задачи.</w:t>
+      </w:r>
+    </w:p>
+    <w:p>
+      <w:pPr>
+        <w:jc w:val="both"/>
+      </w:pPr>
+      <w:r>
+        <w:t>Оформление сделано на Tailwind CSS, переиспользуемые компоненты собраны на shadcn/ui и Radix UI. Сборка и dev-сервер — на Vite.</w:t>
+      </w:r>
+    </w:p>
+    <w:p>
+      <w:pPr>
+        <w:spacing w:before="240" w:after="120"/>
+        <w:ind w:firstLine="0"/>
+        <w:jc w:val="left"/>
+      </w:pPr>
+      <w:r>
+        <w:rPr>
+          <w:b/>
+          <w:sz w:val="28"/>
+        </w:rPr>
+        <w:t>2.7.2 Реализация серверной части</w:t>
+      </w:r>
+    </w:p>
+    <w:p>
+      <w:pPr>
+        <w:jc w:val="both"/>
+      </w:pPr>
+      <w:r>
+        <w:t>Сервер написан на Node.js + Express.js. Бизнес-логика разделена между маршрутами (routes), middleware (проверка сессии и прав) и слоем хранения, который обращается к базе.</w:t>
+      </w:r>
+    </w:p>
+    <w:p>
+      <w:pPr>
+        <w:jc w:val="both"/>
+      </w:pPr>
+      <w:r>
+        <w:t>Список REST-эндпоинтов приведён в таблице 2.16. Эндпоинты под /api/admin доступны только пользователю с флагом администратора — это проверяется через отдельный middleware requireAdmin. Остальные защищённые эндпоинты требуют только активной сессии.</w:t>
+      </w:r>
+    </w:p>
+    <w:p>
+      <w:pPr>
+        <w:jc w:val="both"/>
+      </w:pPr>
+      <w:r>
+        <w:t>Аутентификация выполнена через Passport.js с локальной стратегией. После успешного входа в куку клиента кладётся идентификатор сессии, а сама сессия хранится на сервере в memorystore. Для production такого решения недостаточно — на боевом окружении сессии желательно хранить в Redis или PostgreSQL, — но для текущего объёма нагрузки memorystore работает корректно.</w:t>
+      </w:r>
+    </w:p>
+    <w:p>
+      <w:pPr>
+        <w:jc w:val="both"/>
+      </w:pPr>
+      <w:r>
+        <w:t>Слой хранения вынесен в отдельный класс DbStorage (для PostgreSQL) и MemStorage (для тестирования и локального запуска без базы). В production используется DbStorage, который выполняет операции через Drizzle ORM. Реализация ключевых методов работы с пользователями, заказами, фотографами и продуктами показана в листинге А.2.</w:t>
+      </w:r>
+    </w:p>
+    <w:p>
+      <w:pPr>
+        <w:spacing w:before="240" w:after="120"/>
+        <w:ind w:firstLine="0"/>
+        <w:jc w:val="left"/>
+      </w:pPr>
+      <w:r>
+        <w:rPr>
+          <w:b/>
+          <w:sz w:val="28"/>
+        </w:rPr>
+        <w:t>2.7.3 Реализация взаимодействия с базой данных</w:t>
+      </w:r>
+    </w:p>
+    <w:p>
+      <w:pPr>
+        <w:jc w:val="both"/>
+      </w:pPr>
+      <w:r>
+        <w:t>Работа с базой выполнена через Drizzle ORM — это типобезопасная библиотека для TypeScript, которая описывает таблицы прямо в коде и возвращает типизированные результаты запросов. Схема описана в shared/schema.ts и включает таблицы users, photographers, product_types, orders и order_photos. Полная схема приведена в листинге А.3.</w:t>
+      </w:r>
+    </w:p>
+    <w:p>
+      <w:pPr>
+        <w:jc w:val="both"/>
+      </w:pPr>
+      <w:r>
+        <w:t>Основные сущности и их назначение перечислены в таблице 2.17.</w:t>
+      </w:r>
+    </w:p>
+    <w:p>
+      <w:pPr>
+        <w:jc w:val="both"/>
+      </w:pPr>
+      <w:r>
+        <w:t>Параметры конфигурации товаров описываются Zod-схемами и хранятся в orders в поле product_config (jsonb). Для фотоальбома это size, coverType, pages, paperType; для фотопечати — size, quantity, paperType, border; для календаря — type, size, months, binding. Такой подход позволяет не заводить отдельную таблицу для каждого типа товара и не переусложнять схему.</w:t>
+      </w:r>
+    </w:p>
+    <w:p>
+      <w:pPr>
+        <w:jc w:val="both"/>
+      </w:pPr>
+      <w:r>
+        <w:t>При первом запуске сервер прогоняет seed-скрипт server/seed.ts. Он создаёт администратора (логин admin, пароль admin123), трёх тестовых фотографов и три типа продукции, если они ещё не заведены. Скрипт идемпотентен — повторный запуск не дублирует данные. Полный код приведён в листинге А.4.</w:t>
+      </w:r>
+    </w:p>
+    <w:p>
+      <w:pPr>
+        <w:spacing w:before="240" w:after="120"/>
+        <w:ind w:firstLine="0"/>
+        <w:jc w:val="left"/>
+      </w:pPr>
+      <w:r>
+        <w:rPr>
+          <w:b/>
+          <w:sz w:val="28"/>
+        </w:rPr>
+        <w:t>2.6 Реализация пользовательского интерфейса (переработанные описания)</w:t>
+      </w:r>
+    </w:p>
+    <w:p>
+      <w:pPr>
+        <w:jc w:val="both"/>
+      </w:pPr>
+      <w:r>
+        <w:t>Главная страница. В шапке слева — логотип и контакты, справа — кнопки «Вход» и «Регистрация». В основном экране две крупные кнопки: «Начать заказ» уводит в каталог, «Узнать больше» прокручивает страницу до блока «Наши услуги». Сам блок состоит из трёх карточек: фотоальбомы, фотографии, календари; у каждой — короткое описание. Гостю доступны все эти действия, кроме самого оформления заказа: на него стоит редирект в форму входа. Внизу страницы — блок FAQ с ботом-помощником, который отвечает на типовые вопросы по форматам, срокам, доставке и редактированию заказа.</w:t>
+      </w:r>
+    </w:p>
+    <w:p>
+      <w:pPr>
+        <w:jc w:val="both"/>
+      </w:pPr>
+      <w:r>
+        <w:t>Страница регистрации и авторизации. Один экран на два режима: «Вход» и «Регистрация», переключение через вкладки. В режиме входа пользователь вводит логин и пароль; при успешной проверке его перебрасывает в каталог, при ошибке — показывается сообщение «неверный логин или пароль». В режиме регистрации форма дополнительно проверяет, что логин ещё не занят, что пароль и подтверждение совпадают и что пароль удовлетворяет минимальным требованиям. После успешной регистрации пользователь сразу же авторизуется и попадает в каталог.</w:t>
+      </w:r>
+    </w:p>
+    <w:p>
+      <w:pPr>
+        <w:jc w:val="both"/>
+      </w:pPr>
+      <w:r>
+        <w:t>Страница выбора фотопродукции. На экране три карточки: «Фотографии», «Календарь», «Фотоальбом». В каждой — название, краткое описание, базовая цена и кнопка «Настроить», по которой открывается страница настройки выбранного товара. Внизу страницы расположен отдельный блок с предложением заказать фотографа — отсюда пользователь попадает на страницу выбора и бронирования съёмки.</w:t>
+      </w:r>
+    </w:p>
+    <w:p>
+      <w:pPr>
+        <w:jc w:val="both"/>
+      </w:pPr>
+      <w:r>
+        <w:t>Страница настройки и оформления заказа. Содержимое страницы зависит от выбранного товара. Слева расположена форма параметров: например, для фотопечати это размер (10×15, 15×20, 20×30), количество, тип бумаги и наличие белой рамки. При изменении любого поля стоимость справа пересчитывается мгновенно — для матовой и глянцевой бумаги стоит разная наценка, для крупного формата — другая базовая цена. Под блоком параметров расположен переключатель источника фотографий: «Загрузить фото» или «Услуга фотографа». В первом случае пользователь сразу переходит к загрузке файлов, во втором — к выбору фотографа, даты, времени и места съёмки. Справа — блок «Итого»: товар, его параметры, при заказе фотографа — данные исполнителя, общая сумма и кнопка «Оформить заказ». После подтверждения заказ создаётся и пользователя перебрасывает в личный кабинет.</w:t>
+      </w:r>
+    </w:p>
+    <w:p>
+      <w:pPr>
+        <w:jc w:val="both"/>
+      </w:pPr>
+      <w:r>
+        <w:t>Личный кабинет пользователя. Сверху — имя текущего пользователя. Ниже — раздел «История заказов»: для каждого заказа выводятся тип товара, номер, статус, дата и общая стоимость. Если заказ включал услугу фотографа, дополнительно показывается дата, время и место съёмки. Перехода в отдельную карточку заказа в текущей версии нет — вся существенная информация умещается в строке списка.</w:t>
       </w:r>
     </w:p>
     <w:p>

</xml_diff>